<commit_message>
Change 6: Rapid Response Fund: maximum award decreased from $10,000 to $7,500 (typical range $2,500–$7,500 kept).
Independent test branch created directly from BASELINE v1-original
(a5b0342). Contains this change only.

Co-Authored-By: Claude Opus 5.5 <noreply@anthropic.com>
Claude-Session: https://claude.ai/code/session_01CQxLpwe1Pu1FJJBAM5jt5M
</commit_message>
<xml_diff>
--- a/documents-src/guidelines/cpcf-rapid-response-resilience-fund-guidelines.docx
+++ b/documents-src/guidelines/cpcf-rapid-response-resilience-fund-guidelines.docx
@@ -59,7 +59,7 @@
           </w:p>
           <w:p>
             <w:r>
-              <w:t>Funding: Up to $10,000; most awards range from $2,500 to $7,500</w:t>
+              <w:t>Funding: Up to $7,500; most awards range from $2,500 to $7,500</w:t>
             </w:r>
           </w:p>
           <w:p>
@@ -311,7 +311,7 @@
         <w:rPr>
           <w:i w:val="0"/>
         </w:rPr>
-        <w:t>Up to $10,000; most awards range from $2,500 to $7,500. Emergency response or preparedness project support.</w:t>
+        <w:t>Up to $7,500; most awards range from $2,500 to $7,500. Emergency response or preparedness project support.</w:t>
       </w:r>
     </w:p>
     <w:p>

</xml_diff>